<commit_message>
fix: inline inspection default results
</commit_message>
<xml_diff>
--- a/packages/backend/templates/production-task/塑胶模具检验记录单_副本.docx
+++ b/packages/backend/templates/production-task/塑胶模具检验记录单_副本.docx
@@ -1,6 +1,6 @@
 
 <file path=word/document.xml><?xml version="1.0" encoding="utf-8"?>
-<w:document xmlns:mc="http://schemas.openxmlformats.org/markup-compatibility/2006" xmlns:r="http://schemas.openxmlformats.org/officeDocument/2006/relationships" xmlns:w="http://schemas.openxmlformats.org/wordprocessingml/2006/main" mc:Ignorable="w14 w15 w16se w16cid w16 w16cex w16sdtdh w16sdtfl w16du wp14">
+<w:document xmlns:ns1="http://schemas.openxmlformats.org/markup-compatibility/2006" xmlns:ns2="http://schemas.openxmlformats.org/officeDocument/2006/relationships" xmlns:w="http://schemas.openxmlformats.org/wordprocessingml/2006/main" ns1:Ignorable="w14 w15 w16se w16cid w16 w16cex w16sdtdh w16sdtfl w16du wp14">
   <w:body>
     <w:tbl>
       <w:tblPr>
@@ -18315,7 +18315,7 @@
       </w:r>
     </w:p>
     <w:sectPr>
-      <w:headerReference w:type="first" r:id="rId6"/>
+      <w:headerReference w:type="first" ns2:id="rId6"/>
       <w:pgSz w:w="12240" w:h="15840"/>
       <w:pgMar w:top="1134" w:right="1608" w:bottom="709" w:left="1134" w:header="720" w:footer="720" w:gutter="0"/>
       <w:cols w:space="720"/>

</xml_diff>